<commit_message>
Resolve pre-implementation architecture review findings
Adds ADR-0002 (adapters are real seams: shared Real/Mock interface for
WHOOP/Strava/Ollama; raw-to-classified translation happens once in the
Orchestrator) and ADR-0003 (repository.py splits into
token_repository/metrics_repository/plan_repository by access pattern).

Corrects factual gaps in the SDD found during the review: Orchestrator
and cli were missing from the Module Contracts table; session_scorer's
documented input omitted planned_load_au despite Logic Spec §6.2
requiring it for load_delta_score; daily_engine's input still named raw
WHOOP payload instead of the classified types CONTEXT.md already
defines; and the Ollama adapter's only documented test strategy was a
live call skipped in CI, unable to cover its four documented failure
modes.
</commit_message>
<xml_diff>
--- a/ApexCoach_SDD_v1.0.docx
+++ b/ApexCoach_SDD_v1.0.docx
@@ -672,7 +672,7 @@
           <w:sz w:val="22"/>
           <w:szCs w:val="22"/>
         </w:rPr>
-        <w:t xml:space="preserve">Adapter pattern for all external APIs. WHOOP and Strava are accessed only through adapter classes. Swapping an API or mocking it for tests requires changing one file.</w:t>
+        <w:t>Adapter pattern for all external APIs. WHOOP, Strava, and Ollama are accessed only through adapter classes, each with two concrete implementations — Real and Mock — behind a shared interface, injected at construction. Swapping an API or mocking it for tests requires changing one file, not the transport layer.</w:t>
       </w:r>
     </w:p>
     <w:p>
@@ -4001,7 +4001,35 @@
                 <w:sz w:val="17"/>
                 <w:szCs w:val="17"/>
               </w:rPr>
-              <w:t xml:space="preserve">│   └── repository.py           # All DB reads/writes — no raw SQL outside this file</w:t>
+              <w:t>│   ├── token_repository.py       # OAuth tokens — no raw SQL outside this file</w:t>
+            </w:r>
+          </w:p>
+          <w:p>
+            <w:pPr>
+              <w:spacing w:after="20" w:before="20"/>
+            </w:pPr>
+            <w:r>
+              <w:rPr>
+                <w:rFonts w:ascii="Courier New" w:cs="Courier New" w:eastAsia="Courier New" w:hAnsi="Courier New"/>
+                <w:color w:val="1A3A5C"/>
+                <w:sz w:val="17"/>
+                <w:szCs w:val="17"/>
+              </w:rPr>
+              <w:t>│   ├── metrics_repository.py     # daily_metrics / hr_zones / activities / session_scores — no raw SQL outside this file</w:t>
+            </w:r>
+          </w:p>
+          <w:p>
+            <w:pPr>
+              <w:spacing w:after="20" w:before="20"/>
+            </w:pPr>
+            <w:r>
+              <w:rPr>
+                <w:rFonts w:ascii="Courier New" w:cs="Courier New" w:eastAsia="Courier New" w:hAnsi="Courier New"/>
+                <w:color w:val="1A3A5C"/>
+                <w:sz w:val="17"/>
+                <w:szCs w:val="17"/>
+              </w:rPr>
+              <w:t>│   └── plan_repository.py        # weekly_plans / monthly_targets / decisions — no raw SQL outside this file</w:t>
             </w:r>
           </w:p>
           <w:p>
@@ -4372,112 +4400,40 @@
         <w:tc>
           <w:tcPr>
             <w:tcW w:type="dxa" w:w="2200"/>
-            <w:tcBorders>
-              <w:top w:val="single" w:color="CCCCCC" w:sz="1"/>
-              <w:left w:val="single" w:color="CCCCCC" w:sz="1"/>
-              <w:bottom w:val="single" w:color="CCCCCC" w:sz="1"/>
-              <w:right w:val="single" w:color="CCCCCC" w:sz="1"/>
-            </w:tcBorders>
-            <w:shd w:fill="FFFFFF" w:val="clear"/>
-            <w:tcMar>
-              <w:top w:type="dxa" w:w="80"/>
-              <w:left w:type="dxa" w:w="120"/>
-              <w:bottom w:type="dxa" w:w="80"/>
-              <w:right w:type="dxa" w:w="120"/>
-            </w:tcMar>
-          </w:tcPr>
-          <w:p>
-            <w:r>
-              <w:rPr>
-                <w:rFonts w:ascii="Arial" w:cs="Arial" w:eastAsia="Arial" w:hAnsi="Arial"/>
-                <w:sz w:val="20"/>
-                <w:szCs w:val="20"/>
-              </w:rPr>
-              <w:t xml:space="preserve">zone_calculator</w:t>
+          </w:tcPr>
+          <w:p>
+            <w:r>
+              <w:t>cli</w:t>
             </w:r>
           </w:p>
         </w:tc>
         <w:tc>
           <w:tcPr>
             <w:tcW w:type="dxa" w:w="2200"/>
-            <w:tcBorders>
-              <w:top w:val="single" w:color="CCCCCC" w:sz="1"/>
-              <w:left w:val="single" w:color="CCCCCC" w:sz="1"/>
-              <w:bottom w:val="single" w:color="CCCCCC" w:sz="1"/>
-              <w:right w:val="single" w:color="CCCCCC" w:sz="1"/>
-            </w:tcBorders>
-            <w:shd w:fill="FFFFFF" w:val="clear"/>
-            <w:tcMar>
-              <w:top w:type="dxa" w:w="80"/>
-              <w:left w:type="dxa" w:w="120"/>
-              <w:bottom w:type="dxa" w:w="80"/>
-              <w:right w:type="dxa" w:w="120"/>
-            </w:tcMar>
-          </w:tcPr>
-          <w:p>
-            <w:r>
-              <w:rPr>
-                <w:rFonts w:ascii="Arial" w:cs="Arial" w:eastAsia="Arial" w:hAnsi="Arial"/>
-                <w:sz w:val="20"/>
-                <w:szCs w:val="20"/>
-              </w:rPr>
-              <w:t xml:space="preserve">Max HR (int), Resting HR (int)</w:t>
+          </w:tcPr>
+          <w:p>
+            <w:r>
+              <w:t>Command-line arguments (argparse/Click)</w:t>
             </w:r>
           </w:p>
         </w:tc>
         <w:tc>
           <w:tcPr>
             <w:tcW w:type="dxa" w:w="2200"/>
-            <w:tcBorders>
-              <w:top w:val="single" w:color="CCCCCC" w:sz="1"/>
-              <w:left w:val="single" w:color="CCCCCC" w:sz="1"/>
-              <w:bottom w:val="single" w:color="CCCCCC" w:sz="1"/>
-              <w:right w:val="single" w:color="CCCCCC" w:sz="1"/>
-            </w:tcBorders>
-            <w:shd w:fill="FFFFFF" w:val="clear"/>
-            <w:tcMar>
-              <w:top w:type="dxa" w:w="80"/>
-              <w:left w:type="dxa" w:w="120"/>
-              <w:bottom w:type="dxa" w:w="80"/>
-              <w:right w:type="dxa" w:w="120"/>
-            </w:tcMar>
-          </w:tcPr>
-          <w:p>
-            <w:r>
-              <w:rPr>
-                <w:rFonts w:ascii="Arial" w:cs="Arial" w:eastAsia="Arial" w:hAnsi="Arial"/>
-                <w:sz w:val="20"/>
-                <w:szCs w:val="20"/>
-              </w:rPr>
-              <w:t xml:space="preserve">Dict of 5 zone boundaries (bpm)</w:t>
+          </w:tcPr>
+          <w:p>
+            <w:r>
+              <w:t>stdout recommendation/report, exit code</w:t>
             </w:r>
           </w:p>
         </w:tc>
         <w:tc>
           <w:tcPr>
             <w:tcW w:type="dxa" w:w="2760"/>
-            <w:tcBorders>
-              <w:top w:val="single" w:color="CCCCCC" w:sz="1"/>
-              <w:left w:val="single" w:color="CCCCCC" w:sz="1"/>
-              <w:bottom w:val="single" w:color="CCCCCC" w:sz="1"/>
-              <w:right w:val="single" w:color="CCCCCC" w:sz="1"/>
-            </w:tcBorders>
-            <w:shd w:fill="FFFFFF" w:val="clear"/>
-            <w:tcMar>
-              <w:top w:type="dxa" w:w="80"/>
-              <w:left w:type="dxa" w:w="120"/>
-              <w:bottom w:type="dxa" w:w="80"/>
-              <w:right w:type="dxa" w:w="120"/>
-            </w:tcMar>
-          </w:tcPr>
-          <w:p>
-            <w:r>
-              <w:rPr>
-                <w:rFonts w:ascii="Arial" w:cs="Arial" w:eastAsia="Arial" w:hAnsi="Arial"/>
-                <w:sz w:val="20"/>
-                <w:szCs w:val="20"/>
-              </w:rPr>
-              <w:t xml:space="preserve">Unit — parametrised with known HR values</w:t>
+          </w:tcPr>
+          <w:p>
+            <w:r>
+              <w:t>Integration — full CLI run against mocked Orchestrator</w:t>
             </w:r>
           </w:p>
         </w:tc>
@@ -4486,112 +4442,40 @@
         <w:tc>
           <w:tcPr>
             <w:tcW w:type="dxa" w:w="2200"/>
-            <w:tcBorders>
-              <w:top w:val="single" w:color="CCCCCC" w:sz="1"/>
-              <w:left w:val="single" w:color="CCCCCC" w:sz="1"/>
-              <w:bottom w:val="single" w:color="CCCCCC" w:sz="1"/>
-              <w:right w:val="single" w:color="CCCCCC" w:sz="1"/>
-            </w:tcBorders>
-            <w:shd w:fill="F5F5F5" w:val="clear"/>
-            <w:tcMar>
-              <w:top w:type="dxa" w:w="80"/>
-              <w:left w:type="dxa" w:w="120"/>
-              <w:bottom w:type="dxa" w:w="80"/>
-              <w:right w:type="dxa" w:w="120"/>
-            </w:tcMar>
-          </w:tcPr>
-          <w:p>
-            <w:r>
-              <w:rPr>
-                <w:rFonts w:ascii="Arial" w:cs="Arial" w:eastAsia="Arial" w:hAnsi="Arial"/>
-                <w:sz w:val="20"/>
-                <w:szCs w:val="20"/>
-              </w:rPr>
-              <w:t xml:space="preserve">load_calculator</w:t>
+          </w:tcPr>
+          <w:p>
+            <w:r>
+              <w:t>orchestrator</w:t>
             </w:r>
           </w:p>
         </w:tc>
         <w:tc>
           <w:tcPr>
             <w:tcW w:type="dxa" w:w="2200"/>
-            <w:tcBorders>
-              <w:top w:val="single" w:color="CCCCCC" w:sz="1"/>
-              <w:left w:val="single" w:color="CCCCCC" w:sz="1"/>
-              <w:bottom w:val="single" w:color="CCCCCC" w:sz="1"/>
-              <w:right w:val="single" w:color="CCCCCC" w:sz="1"/>
-            </w:tcBorders>
-            <w:shd w:fill="F5F5F5" w:val="clear"/>
-            <w:tcMar>
-              <w:top w:type="dxa" w:w="80"/>
-              <w:left w:type="dxa" w:w="120"/>
-              <w:bottom w:type="dxa" w:w="80"/>
-              <w:right w:type="dxa" w:w="120"/>
-            </w:tcMar>
-          </w:tcPr>
-          <w:p>
-            <w:r>
-              <w:rPr>
-                <w:rFonts w:ascii="Arial" w:cs="Arial" w:eastAsia="Arial" w:hAnsi="Arial"/>
-                <w:sz w:val="20"/>
-                <w:szCs w:val="20"/>
-              </w:rPr>
-              <w:t xml:space="preserve">Distance (m), Duration (s), Elevation (m), Avg HR (bpm)</w:t>
+          </w:tcPr>
+          <w:p>
+            <w:r>
+              <w:t>Adapter outputs (raw typed payloads: WhoopDailyPayload, StravaActivity), engine outputs</w:t>
             </w:r>
           </w:p>
         </w:tc>
         <w:tc>
           <w:tcPr>
             <w:tcW w:type="dxa" w:w="2200"/>
-            <w:tcBorders>
-              <w:top w:val="single" w:color="CCCCCC" w:sz="1"/>
-              <w:left w:val="single" w:color="CCCCCC" w:sz="1"/>
-              <w:bottom w:val="single" w:color="CCCCCC" w:sz="1"/>
-              <w:right w:val="single" w:color="CCCCCC" w:sz="1"/>
-            </w:tcBorders>
-            <w:shd w:fill="F5F5F5" w:val="clear"/>
-            <w:tcMar>
-              <w:top w:type="dxa" w:w="80"/>
-              <w:left w:type="dxa" w:w="120"/>
-              <w:bottom w:type="dxa" w:w="80"/>
-              <w:right w:type="dxa" w:w="120"/>
-            </w:tcMar>
-          </w:tcPr>
-          <w:p>
-            <w:r>
-              <w:rPr>
-                <w:rFonts w:ascii="Arial" w:cs="Arial" w:eastAsia="Arial" w:hAnsi="Arial"/>
-                <w:sz w:val="20"/>
-                <w:szCs w:val="20"/>
-              </w:rPr>
-              <w:t xml:space="preserve">Load score (float), Grade-adjusted pace (float)</w:t>
+          </w:tcPr>
+          <w:p>
+            <w:r>
+              <w:t>Classified inputs per engine (Recovery Band, HRV Delta, Soreness Band); enforces monthly → weekly → daily authority</w:t>
             </w:r>
           </w:p>
         </w:tc>
         <w:tc>
           <w:tcPr>
             <w:tcW w:type="dxa" w:w="2760"/>
-            <w:tcBorders>
-              <w:top w:val="single" w:color="CCCCCC" w:sz="1"/>
-              <w:left w:val="single" w:color="CCCCCC" w:sz="1"/>
-              <w:bottom w:val="single" w:color="CCCCCC" w:sz="1"/>
-              <w:right w:val="single" w:color="CCCCCC" w:sz="1"/>
-            </w:tcBorders>
-            <w:shd w:fill="F5F5F5" w:val="clear"/>
-            <w:tcMar>
-              <w:top w:type="dxa" w:w="80"/>
-              <w:left w:type="dxa" w:w="120"/>
-              <w:bottom w:type="dxa" w:w="80"/>
-              <w:right w:type="dxa" w:w="120"/>
-            </w:tcMar>
-          </w:tcPr>
-          <w:p>
-            <w:r>
-              <w:rPr>
-                <w:rFonts w:ascii="Arial" w:cs="Arial" w:eastAsia="Arial" w:hAnsi="Arial"/>
-                <w:sz w:val="20"/>
-                <w:szCs w:val="20"/>
-              </w:rPr>
-              <w:t xml:space="preserve">Unit — parametrised with flat vs hilly runs</w:t>
+          </w:tcPr>
+          <w:p>
+            <w:r>
+              <w:t>Integration — verify call ordering, raw→classified translation, and that no engine can override a higher-horizon constraint</w:t>
             </w:r>
           </w:p>
         </w:tc>
@@ -4621,7 +4505,7 @@
                 <w:sz w:val="20"/>
                 <w:szCs w:val="20"/>
               </w:rPr>
-              <w:t xml:space="preserve">session_scorer</w:t>
+              <w:t xml:space="preserve">zone_calculator</w:t>
             </w:r>
           </w:p>
         </w:tc>
@@ -4649,7 +4533,7 @@
                 <w:sz w:val="20"/>
                 <w:szCs w:val="20"/>
               </w:rPr>
-              <w:t xml:space="preserve">Strava activity JSON, Intended zone label, RPE (int)</w:t>
+              <w:t xml:space="preserve">Max HR (int), Resting HR (int)</w:t>
             </w:r>
           </w:p>
         </w:tc>
@@ -4677,7 +4561,7 @@
                 <w:sz w:val="20"/>
                 <w:szCs w:val="20"/>
               </w:rPr>
-              <w:t xml:space="preserve">Execution score (0–100), Flags (overpush / underpush)</w:t>
+              <w:t xml:space="preserve">Dict of 5 zone boundaries (bpm)</w:t>
             </w:r>
           </w:p>
         </w:tc>
@@ -4705,7 +4589,7 @@
                 <w:sz w:val="20"/>
                 <w:szCs w:val="20"/>
               </w:rPr>
-              <w:t xml:space="preserve">Integration — inject mock Strava payloads</w:t>
+              <w:t xml:space="preserve">Unit — parametrised with known HR values</w:t>
             </w:r>
           </w:p>
         </w:tc>
@@ -4735,7 +4619,7 @@
                 <w:sz w:val="20"/>
                 <w:szCs w:val="20"/>
               </w:rPr>
-              <w:t xml:space="preserve">health_check</w:t>
+              <w:t xml:space="preserve">load_calculator</w:t>
             </w:r>
           </w:p>
         </w:tc>
@@ -4763,7 +4647,7 @@
                 <w:sz w:val="20"/>
                 <w:szCs w:val="20"/>
               </w:rPr>
-              <w:t xml:space="preserve">Yesterday's session type (str), Previous check data</w:t>
+              <w:t xml:space="preserve">Distance (m), Duration (s), Elevation (m), Avg HR (bpm)</w:t>
             </w:r>
           </w:p>
         </w:tc>
@@ -4791,7 +4675,7 @@
                 <w:sz w:val="20"/>
                 <w:szCs w:val="20"/>
               </w:rPr>
-              <w:t xml:space="preserve">Dict of scored health check responses</w:t>
+              <w:t xml:space="preserve">Load score (float), Grade-adjusted pace (float)</w:t>
             </w:r>
           </w:p>
         </w:tc>
@@ -4819,7 +4703,7 @@
                 <w:sz w:val="20"/>
                 <w:szCs w:val="20"/>
               </w:rPr>
-              <w:t xml:space="preserve">Unit — adaptive question logic tested per session type</w:t>
+              <w:t xml:space="preserve">Unit — parametrised with flat vs hilly runs</w:t>
             </w:r>
           </w:p>
         </w:tc>
@@ -4849,7 +4733,7 @@
                 <w:sz w:val="20"/>
                 <w:szCs w:val="20"/>
               </w:rPr>
-              <w:t xml:space="preserve">daily_engine</w:t>
+              <w:t xml:space="preserve">session_scorer</w:t>
             </w:r>
           </w:p>
         </w:tc>
@@ -4877,7 +4761,7 @@
                 <w:sz w:val="20"/>
                 <w:szCs w:val="20"/>
               </w:rPr>
-              <w:t xml:space="preserve">WHOOP payload, Health check scores, Training plan entry</w:t>
+              <w:t>Strava activity JSON, Intended zone label, RPE (int), planned_load_au (from weekly_engine / training plan)</w:t>
             </w:r>
           </w:p>
         </w:tc>
@@ -4905,7 +4789,7 @@
                 <w:sz w:val="20"/>
                 <w:szCs w:val="20"/>
               </w:rPr>
-              <w:t xml:space="preserve">Decision enum + rationale dict</w:t>
+              <w:t xml:space="preserve">Execution score (0–100), Flags (overpush / underpush)</w:t>
             </w:r>
           </w:p>
         </w:tc>
@@ -4933,7 +4817,7 @@
                 <w:sz w:val="20"/>
                 <w:szCs w:val="20"/>
               </w:rPr>
-              <w:t xml:space="preserve">Unit — full decision matrix (all Recovery x Soreness x Session permutations)</w:t>
+              <w:t xml:space="preserve">Integration — inject mock Strava payloads</w:t>
             </w:r>
           </w:p>
         </w:tc>
@@ -4963,7 +4847,7 @@
                 <w:sz w:val="20"/>
                 <w:szCs w:val="20"/>
               </w:rPr>
-              <w:t xml:space="preserve">weekly_engine</w:t>
+              <w:t xml:space="preserve">health_check</w:t>
             </w:r>
           </w:p>
         </w:tc>
@@ -4991,7 +4875,7 @@
                 <w:sz w:val="20"/>
                 <w:szCs w:val="20"/>
               </w:rPr>
-              <w:t xml:space="preserve">Weekly session log, Monthly target, WHOOP 7-day trend</w:t>
+              <w:t xml:space="preserve">Yesterday's session type (str), Previous check data</w:t>
             </w:r>
           </w:p>
         </w:tc>
@@ -5019,7 +4903,7 @@
                 <w:sz w:val="20"/>
                 <w:szCs w:val="20"/>
               </w:rPr>
-              <w:t xml:space="preserve">Adapted weekly plan diff</w:t>
+              <w:t xml:space="preserve">Dict of scored health check responses</w:t>
             </w:r>
           </w:p>
         </w:tc>
@@ -5047,7 +4931,7 @@
                 <w:sz w:val="20"/>
                 <w:szCs w:val="20"/>
               </w:rPr>
-              <w:t xml:space="preserve">Integration — simulate skipped sessions, verify rescheduling</w:t>
+              <w:t xml:space="preserve">Unit — adaptive question logic tested per session type</w:t>
             </w:r>
           </w:p>
         </w:tc>
@@ -5077,7 +4961,7 @@
                 <w:sz w:val="20"/>
                 <w:szCs w:val="20"/>
               </w:rPr>
-              <w:t xml:space="preserve">monthly_engine</w:t>
+              <w:t xml:space="preserve">daily_engine</w:t>
             </w:r>
           </w:p>
         </w:tc>
@@ -5105,7 +4989,7 @@
                 <w:sz w:val="20"/>
                 <w:szCs w:val="20"/>
               </w:rPr>
-              <w:t xml:space="preserve">Session scores (all), Load targets, Race calendar</w:t>
+              <w:t>Classified inputs from Orchestrator (Recovery Band, HRV Delta, Soreness Band), Health check scores, Training plan entry</w:t>
             </w:r>
           </w:p>
         </w:tc>
@@ -5133,7 +5017,7 @@
                 <w:sz w:val="20"/>
                 <w:szCs w:val="20"/>
               </w:rPr>
-              <w:t xml:space="preserve">Monthly summary, Load forecast, Phase recommendation</w:t>
+              <w:t xml:space="preserve">Decision enum + rationale dict</w:t>
             </w:r>
           </w:p>
         </w:tc>
@@ -5161,7 +5045,7 @@
                 <w:sz w:val="20"/>
                 <w:szCs w:val="20"/>
               </w:rPr>
-              <w:t xml:space="preserve">Integration — simulate full training block</w:t>
+              <w:t xml:space="preserve">Unit — full decision matrix (all Recovery x Soreness x Session permutations)</w:t>
             </w:r>
           </w:p>
         </w:tc>
@@ -5191,7 +5075,7 @@
                 <w:sz w:val="20"/>
                 <w:szCs w:val="20"/>
               </w:rPr>
-              <w:t xml:space="preserve">whoop_adapter</w:t>
+              <w:t xml:space="preserve">weekly_engine</w:t>
             </w:r>
           </w:p>
         </w:tc>
@@ -5219,7 +5103,7 @@
                 <w:sz w:val="20"/>
                 <w:szCs w:val="20"/>
               </w:rPr>
-              <w:t xml:space="preserve">OAuth credentials (from .env)</w:t>
+              <w:t xml:space="preserve">Weekly session log, Monthly target, WHOOP 7-day trend</w:t>
             </w:r>
           </w:p>
         </w:tc>
@@ -5247,7 +5131,7 @@
                 <w:sz w:val="20"/>
                 <w:szCs w:val="20"/>
               </w:rPr>
-              <w:t xml:space="preserve">Typed WhoopDailyPayload model</w:t>
+              <w:t xml:space="preserve">Adapted weekly plan diff</w:t>
             </w:r>
           </w:p>
         </w:tc>
@@ -5275,7 +5159,7 @@
                 <w:sz w:val="20"/>
                 <w:szCs w:val="20"/>
               </w:rPr>
-              <w:t xml:space="preserve">Unit — mock httpx, test token refresh</w:t>
+              <w:t xml:space="preserve">Integration — simulate skipped sessions, verify rescheduling</w:t>
             </w:r>
           </w:p>
         </w:tc>
@@ -5305,7 +5189,7 @@
                 <w:sz w:val="20"/>
                 <w:szCs w:val="20"/>
               </w:rPr>
-              <w:t xml:space="preserve">strava_adapter</w:t>
+              <w:t xml:space="preserve">monthly_engine</w:t>
             </w:r>
           </w:p>
         </w:tc>
@@ -5333,7 +5217,7 @@
                 <w:sz w:val="20"/>
                 <w:szCs w:val="20"/>
               </w:rPr>
-              <w:t xml:space="preserve">OAuth credentials, Activity ID</w:t>
+              <w:t xml:space="preserve">Session scores (all), Load targets, Race calendar</w:t>
             </w:r>
           </w:p>
         </w:tc>
@@ -5361,7 +5245,7 @@
                 <w:sz w:val="20"/>
                 <w:szCs w:val="20"/>
               </w:rPr>
-              <w:t xml:space="preserve">Typed StravaActivity model</w:t>
+              <w:t xml:space="preserve">Monthly summary, Load forecast, Phase recommendation</w:t>
             </w:r>
           </w:p>
         </w:tc>
@@ -5389,7 +5273,7 @@
                 <w:sz w:val="20"/>
                 <w:szCs w:val="20"/>
               </w:rPr>
-              <w:t xml:space="preserve">Unit — mock httpx, test pagination</w:t>
+              <w:t xml:space="preserve">Integration — simulate full training block</w:t>
             </w:r>
           </w:p>
         </w:tc>
@@ -5419,7 +5303,7 @@
                 <w:sz w:val="20"/>
                 <w:szCs w:val="20"/>
               </w:rPr>
-              <w:t xml:space="preserve">ollama_adapter</w:t>
+              <w:t xml:space="preserve">whoop_adapter</w:t>
             </w:r>
           </w:p>
         </w:tc>
@@ -5447,7 +5331,7 @@
                 <w:sz w:val="20"/>
                 <w:szCs w:val="20"/>
               </w:rPr>
-              <w:t xml:space="preserve">Structured JSON decision output</w:t>
+              <w:t xml:space="preserve">OAuth credentials (from .env)</w:t>
             </w:r>
           </w:p>
         </w:tc>
@@ -5475,7 +5359,7 @@
                 <w:sz w:val="20"/>
                 <w:szCs w:val="20"/>
               </w:rPr>
-              <w:t xml:space="preserve">Natural language explanation string</w:t>
+              <w:t xml:space="preserve">Typed WhoopDailyPayload model</w:t>
             </w:r>
           </w:p>
         </w:tc>
@@ -5503,7 +5387,7 @@
                 <w:sz w:val="20"/>
                 <w:szCs w:val="20"/>
               </w:rPr>
-              <w:t xml:space="preserve">Integration — live Ollama call (skipped in CI)</w:t>
+              <w:t>Unit — MockWhoopAdapter substitutes RealWhoopAdapter behind shared interface; token refresh tested against both</w:t>
             </w:r>
           </w:p>
         </w:tc>
@@ -5533,7 +5417,7 @@
                 <w:sz w:val="20"/>
                 <w:szCs w:val="20"/>
               </w:rPr>
-              <w:t xml:space="preserve">repository</w:t>
+              <w:t xml:space="preserve">strava_adapter</w:t>
             </w:r>
           </w:p>
         </w:tc>
@@ -5561,7 +5445,7 @@
                 <w:sz w:val="20"/>
                 <w:szCs w:val="20"/>
               </w:rPr>
-              <w:t xml:space="preserve">Typed model instances</w:t>
+              <w:t xml:space="preserve">OAuth credentials, Activity ID</w:t>
             </w:r>
           </w:p>
         </w:tc>
@@ -5589,7 +5473,7 @@
                 <w:sz w:val="20"/>
                 <w:szCs w:val="20"/>
               </w:rPr>
-              <w:t xml:space="preserve">DB read/write confirmation or query results</w:t>
+              <w:t xml:space="preserve">Typed StravaActivity model</w:t>
             </w:r>
           </w:p>
         </w:tc>
@@ -5617,7 +5501,247 @@
                 <w:sz w:val="20"/>
                 <w:szCs w:val="20"/>
               </w:rPr>
-              <w:t xml:space="preserve">Integration — in-memory SQLite per test</w:t>
+              <w:t>Unit — MockStravaAdapter substitutes RealStravaAdapter behind shared interface; pagination tested against both</w:t>
+            </w:r>
+          </w:p>
+        </w:tc>
+      </w:tr>
+      <w:tr>
+        <w:tc>
+          <w:tcPr>
+            <w:tcW w:type="dxa" w:w="2200"/>
+            <w:tcBorders>
+              <w:top w:val="single" w:color="CCCCCC" w:sz="1"/>
+              <w:left w:val="single" w:color="CCCCCC" w:sz="1"/>
+              <w:bottom w:val="single" w:color="CCCCCC" w:sz="1"/>
+              <w:right w:val="single" w:color="CCCCCC" w:sz="1"/>
+            </w:tcBorders>
+            <w:shd w:fill="F5F5F5" w:val="clear"/>
+            <w:tcMar>
+              <w:top w:type="dxa" w:w="80"/>
+              <w:left w:type="dxa" w:w="120"/>
+              <w:bottom w:type="dxa" w:w="80"/>
+              <w:right w:type="dxa" w:w="120"/>
+            </w:tcMar>
+          </w:tcPr>
+          <w:p>
+            <w:r>
+              <w:rPr>
+                <w:rFonts w:ascii="Arial" w:cs="Arial" w:eastAsia="Arial" w:hAnsi="Arial"/>
+                <w:sz w:val="20"/>
+                <w:szCs w:val="20"/>
+              </w:rPr>
+              <w:t xml:space="preserve">ollama_adapter</w:t>
+            </w:r>
+          </w:p>
+        </w:tc>
+        <w:tc>
+          <w:tcPr>
+            <w:tcW w:type="dxa" w:w="2200"/>
+            <w:tcBorders>
+              <w:top w:val="single" w:color="CCCCCC" w:sz="1"/>
+              <w:left w:val="single" w:color="CCCCCC" w:sz="1"/>
+              <w:bottom w:val="single" w:color="CCCCCC" w:sz="1"/>
+              <w:right w:val="single" w:color="CCCCCC" w:sz="1"/>
+            </w:tcBorders>
+            <w:shd w:fill="F5F5F5" w:val="clear"/>
+            <w:tcMar>
+              <w:top w:type="dxa" w:w="80"/>
+              <w:left w:type="dxa" w:w="120"/>
+              <w:bottom w:type="dxa" w:w="80"/>
+              <w:right w:type="dxa" w:w="120"/>
+            </w:tcMar>
+          </w:tcPr>
+          <w:p>
+            <w:r>
+              <w:rPr>
+                <w:rFonts w:ascii="Arial" w:cs="Arial" w:eastAsia="Arial" w:hAnsi="Arial"/>
+                <w:sz w:val="20"/>
+                <w:szCs w:val="20"/>
+              </w:rPr>
+              <w:t xml:space="preserve">Structured JSON decision output</w:t>
+            </w:r>
+          </w:p>
+        </w:tc>
+        <w:tc>
+          <w:tcPr>
+            <w:tcW w:type="dxa" w:w="2200"/>
+            <w:tcBorders>
+              <w:top w:val="single" w:color="CCCCCC" w:sz="1"/>
+              <w:left w:val="single" w:color="CCCCCC" w:sz="1"/>
+              <w:bottom w:val="single" w:color="CCCCCC" w:sz="1"/>
+              <w:right w:val="single" w:color="CCCCCC" w:sz="1"/>
+            </w:tcBorders>
+            <w:shd w:fill="F5F5F5" w:val="clear"/>
+            <w:tcMar>
+              <w:top w:type="dxa" w:w="80"/>
+              <w:left w:type="dxa" w:w="120"/>
+              <w:bottom w:type="dxa" w:w="80"/>
+              <w:right w:type="dxa" w:w="120"/>
+            </w:tcMar>
+          </w:tcPr>
+          <w:p>
+            <w:r>
+              <w:rPr>
+                <w:rFonts w:ascii="Arial" w:cs="Arial" w:eastAsia="Arial" w:hAnsi="Arial"/>
+                <w:sz w:val="20"/>
+                <w:szCs w:val="20"/>
+              </w:rPr>
+              <w:t xml:space="preserve">Natural language explanation string</w:t>
+            </w:r>
+          </w:p>
+        </w:tc>
+        <w:tc>
+          <w:tcPr>
+            <w:tcW w:type="dxa" w:w="2760"/>
+            <w:tcBorders>
+              <w:top w:val="single" w:color="CCCCCC" w:sz="1"/>
+              <w:left w:val="single" w:color="CCCCCC" w:sz="1"/>
+              <w:bottom w:val="single" w:color="CCCCCC" w:sz="1"/>
+              <w:right w:val="single" w:color="CCCCCC" w:sz="1"/>
+            </w:tcBorders>
+            <w:shd w:fill="F5F5F5" w:val="clear"/>
+            <w:tcMar>
+              <w:top w:type="dxa" w:w="80"/>
+              <w:left w:type="dxa" w:w="120"/>
+              <w:bottom w:type="dxa" w:w="80"/>
+              <w:right w:type="dxa" w:w="120"/>
+            </w:tcMar>
+          </w:tcPr>
+          <w:p>
+            <w:r>
+              <w:rPr>
+                <w:rFonts w:ascii="Arial" w:cs="Arial" w:eastAsia="Arial" w:hAnsi="Arial"/>
+                <w:sz w:val="20"/>
+                <w:szCs w:val="20"/>
+              </w:rPr>
+              <w:t>Unit — MockOllamaAdapter simulates all 4 documented failure modes; live call retained as manual smoke test only, skipped in CI</w:t>
+            </w:r>
+          </w:p>
+        </w:tc>
+      </w:tr>
+      <w:tr>
+        <w:tc>
+          <w:tcPr>
+            <w:tcW w:type="dxa" w:w="2200"/>
+          </w:tcPr>
+          <w:p>
+            <w:r>
+              <w:t>token_repository</w:t>
+            </w:r>
+          </w:p>
+        </w:tc>
+        <w:tc>
+          <w:tcPr>
+            <w:tcW w:type="dxa" w:w="2200"/>
+          </w:tcPr>
+          <w:p>
+            <w:r>
+              <w:t>Typed OAuth token model instances</w:t>
+            </w:r>
+          </w:p>
+        </w:tc>
+        <w:tc>
+          <w:tcPr>
+            <w:tcW w:type="dxa" w:w="2200"/>
+          </w:tcPr>
+          <w:p>
+            <w:r>
+              <w:t>DB read/write confirmation</w:t>
+            </w:r>
+          </w:p>
+        </w:tc>
+        <w:tc>
+          <w:tcPr>
+            <w:tcW w:type="dxa" w:w="2760"/>
+          </w:tcPr>
+          <w:p>
+            <w:r>
+              <w:t>Integration — in-memory SQLite per test</w:t>
+            </w:r>
+          </w:p>
+        </w:tc>
+      </w:tr>
+      <w:tr>
+        <w:tc>
+          <w:tcPr>
+            <w:tcW w:type="dxa" w:w="2200"/>
+          </w:tcPr>
+          <w:p>
+            <w:r>
+              <w:t>metrics_repository</w:t>
+            </w:r>
+          </w:p>
+        </w:tc>
+        <w:tc>
+          <w:tcPr>
+            <w:tcW w:type="dxa" w:w="2200"/>
+          </w:tcPr>
+          <w:p>
+            <w:r>
+              <w:t>Typed daily_metrics / hr_zones / activities / session_scores model instances</w:t>
+            </w:r>
+          </w:p>
+        </w:tc>
+        <w:tc>
+          <w:tcPr>
+            <w:tcW w:type="dxa" w:w="2200"/>
+          </w:tcPr>
+          <w:p>
+            <w:r>
+              <w:t>DB read/write confirmation or query results</w:t>
+            </w:r>
+          </w:p>
+        </w:tc>
+        <w:tc>
+          <w:tcPr>
+            <w:tcW w:type="dxa" w:w="2760"/>
+          </w:tcPr>
+          <w:p>
+            <w:r>
+              <w:t>Integration — in-memory SQLite per test</w:t>
+            </w:r>
+          </w:p>
+        </w:tc>
+      </w:tr>
+      <w:tr>
+        <w:tc>
+          <w:tcPr>
+            <w:tcW w:type="dxa" w:w="2200"/>
+          </w:tcPr>
+          <w:p>
+            <w:r>
+              <w:t>plan_repository</w:t>
+            </w:r>
+          </w:p>
+        </w:tc>
+        <w:tc>
+          <w:tcPr>
+            <w:tcW w:type="dxa" w:w="2200"/>
+          </w:tcPr>
+          <w:p>
+            <w:r>
+              <w:t>Typed weekly_plans / monthly_targets / decisions model instances</w:t>
+            </w:r>
+          </w:p>
+        </w:tc>
+        <w:tc>
+          <w:tcPr>
+            <w:tcW w:type="dxa" w:w="2200"/>
+          </w:tcPr>
+          <w:p>
+            <w:r>
+              <w:t>DB read/write confirmation or query results</w:t>
+            </w:r>
+          </w:p>
+        </w:tc>
+        <w:tc>
+          <w:tcPr>
+            <w:tcW w:type="dxa" w:w="2760"/>
+          </w:tcPr>
+          <w:p>
+            <w:r>
+              <w:t>Integration — in-memory SQLite per test</w:t>
             </w:r>
           </w:p>
         </w:tc>
@@ -18648,7 +18772,7 @@
           <w:sz w:val="22"/>
           <w:szCs w:val="22"/>
         </w:rPr>
-        <w:t xml:space="preserve">The repository layer is the only place that writes to the DB. Integration tests use an in-memory SQLite instance created fresh per test.</w:t>
+        <w:t>Each repository module (token_repository, metrics_repository, plan_repository) is the only place that writes to its own tables — no raw SQL elsewhere. Integration tests use an in-memory SQLite instance created fresh per test.</w:t>
       </w:r>
     </w:p>
     <w:p>
@@ -18688,7 +18812,7 @@
           <w:sz w:val="22"/>
           <w:szCs w:val="22"/>
         </w:rPr>
-        <w:t xml:space="preserve">The Ollama adapter integration test is marked with a custom @pytest.mark.live_llm marker and is skipped in CI. It runs manually to verify the explanation layer.</w:t>
+        <w:t>The four documented Ollama failure modes (connection refused, model not found, timeout, malformed output) are unit-tested via MockOllamaAdapter, which simulates each deterministically. The one live-call integration test is marked with a custom @pytest.mark.live_llm marker and is skipped in CI — it runs manually only as a smoke test, not as failure-mode coverage.</w:t>
       </w:r>
     </w:p>
     <w:p>

</xml_diff>